<commit_message>
Kleine Anpassungen + PDF - 1.0 Doku
</commit_message>
<xml_diff>
--- a/Projektarbeit_DBWE_Scooter_Andreas_20260321.docx
+++ b/Projektarbeit_DBWE_Scooter_Andreas_20260321.docx
@@ -7974,6 +7974,12 @@
         </w:rPr>
         <w:t>Für den Betrieb der Webapplikation wird eine klassische Client-Server-Architektur verwendet. Die Anwendung wird über das Internet bereitgestellt, sodass Benutzer über einen Webbrowser darauf zugreifen können.</w:t>
       </w:r>
+      <w:r>
+        <w:rPr>
+          <w:rFonts w:ascii="Arial" w:hAnsi="Arial" w:cs="Arial"/>
+        </w:rPr>
+        <w:t xml:space="preserve"> Der Webservice Render wird hier genutzt.</w:t>
+      </w:r>
     </w:p>
     <w:p>
       <w:pPr>
@@ -8422,7 +8428,7 @@
         <w:rPr>
           <w:rFonts w:ascii="Arial" w:eastAsiaTheme="majorEastAsia" w:hAnsi="Arial" w:cs="Arial"/>
         </w:rPr>
-        <w:t xml:space="preserve"> </w:t>
+        <w:t>, Render</w:t>
       </w:r>
     </w:p>
     <w:p>
@@ -8448,7 +8454,19 @@
         <w:rPr>
           <w:rFonts w:ascii="Arial" w:eastAsiaTheme="majorEastAsia" w:hAnsi="Arial" w:cs="Arial"/>
         </w:rPr>
-        <w:t xml:space="preserve"> Relationales Datenbanksystem (z. B. MySQL oder PostgreSQL) </w:t>
+        <w:t xml:space="preserve"> Relationales Datenbanksystem (z.B. </w:t>
+      </w:r>
+      <w:r>
+        <w:rPr>
+          <w:rFonts w:ascii="Arial" w:eastAsiaTheme="majorEastAsia" w:hAnsi="Arial" w:cs="Arial"/>
+        </w:rPr>
+        <w:t>SQLite</w:t>
+      </w:r>
+      <w:r>
+        <w:rPr>
+          <w:rFonts w:ascii="Arial" w:eastAsiaTheme="majorEastAsia" w:hAnsi="Arial" w:cs="Arial"/>
+        </w:rPr>
+        <w:t xml:space="preserve">) </w:t>
       </w:r>
     </w:p>
     <w:p>
@@ -8481,6 +8499,7 @@
     </w:p>
     <w:p>
       <w:pPr>
+        <w:spacing w:after="0"/>
         <w:rPr>
           <w:rFonts w:ascii="Arial" w:eastAsiaTheme="majorEastAsia" w:hAnsi="Arial" w:cs="Arial"/>
         </w:rPr>

</xml_diff>